<commit_message>
Final: prompt history with backend MCP iteration; refreshed live screenshots
- 02-prompt-history.md: added prompts 7 (Supabase MCP integration, model swap
  to Gemini 2.5 Flash after Claude 3.5 Haiku mangled Cyrillic) and 8 (refusal
  to put OPENROUTER key on the client).
- docs/screenshots/*: refreshed from live https://66dplus.github.io/mindmatch/
  after redeploy with real Supabase + OpenRouter wiring.

End-to-end verified via Supabase MCP: services=3, available_slots=120,
bookings insert + mark_slot_taken trigger both fire correctly.
</commit_message>
<xml_diff>
--- a/docs/deliverables/02-prompt-history.docx
+++ b/docs/deliverables/02-prompt-history.docx
@@ -2,7 +2,7 @@
 <file path=word/document.xml><?xml version="1.0" encoding="utf-8"?>
 <w:document xmlns:w="http://schemas.openxmlformats.org/wordprocessingml/2006/main" xmlns:m="http://schemas.openxmlformats.org/officeDocument/2006/math" xmlns:r="http://schemas.openxmlformats.org/officeDocument/2006/relationships" xmlns:o="urn:schemas-microsoft-com:office:office" xmlns:v="urn:schemas-microsoft-com:vml" xmlns:w10="urn:schemas-microsoft-com:office:word" xmlns:a="http://schemas.openxmlformats.org/drawingml/2006/main" xmlns:pic="http://schemas.openxmlformats.org/drawingml/2006/picture" xmlns:wp="http://schemas.openxmlformats.org/drawingml/2006/wordprocessingDrawing">
   <w:body>
-    <w:bookmarkStart w:id="20" w:name="история-промптов"/>
+    <w:bookmarkStart w:id="22" w:name="история-промптов"/>
     <w:p>
       <w:pPr>
         <w:pStyle w:val="Heading1"/>
@@ -670,22 +670,21 @@
       </w:r>
     </w:p>
     <w:bookmarkEnd w:id="14"/>
-    <w:bookmarkStart w:id="18" w:name="Xef1a59cf50ed3bde39338dff469e2ff902c3b14"/>
+    <w:bookmarkStart w:id="15" w:name="X21e9221fbb6a399d0e1f967ae60b2c50d9880e0"/>
     <w:p>
       <w:pPr>
         <w:pStyle w:val="Heading2"/>
       </w:pPr>
       <w:r>
-        <w:t xml:space="preserve">Эволюция: что не сработало и как я доправлял</w:t>
-      </w:r>
-    </w:p>
-    <w:bookmarkStart w:id="15" w:name="итерация-1-2-форма-квалификации"/>
-    <w:p>
-      <w:pPr>
-        <w:pStyle w:val="Heading3"/>
-      </w:pPr>
-      <w:r>
-        <w:t xml:space="preserve">Итерация 1 → 2 (форма квалификации)</w:t>
+        <w:t xml:space="preserve">Промпт 7. Боевая интеграция backend через MCP</w:t>
+      </w:r>
+    </w:p>
+    <w:p>
+      <w:pPr>
+        <w:pStyle w:val="BlockText"/>
+      </w:pPr>
+      <w:r>
+        <w:t xml:space="preserve">«У меня уже создан Supabase-проект, я авторизовал MCP. Применяй миграции и деплой edge function ты сам, без CLI и без копипасты.»</w:t>
       </w:r>
     </w:p>
     <w:p>
@@ -697,10 +696,49 @@
           <w:b/>
           <w:bCs/>
         </w:rPr>
-        <w:t xml:space="preserve">Первый вариант от AI</w:t>
-      </w:r>
-      <w:r>
-        <w:t xml:space="preserve">: 5 вопросов на отдельных шагах wizard (один вопрос — один экран).</w:t>
+        <w:t xml:space="preserve">Что вернул AI</w:t>
+      </w:r>
+      <w:r>
+        <w:t xml:space="preserve">: через Supabase MCP применил две миграции (</w:t>
+      </w:r>
+      <w:r>
+        <w:rPr>
+          <w:rStyle w:val="VerbatimChar"/>
+        </w:rPr>
+        <w:t xml:space="preserve">init</w:t>
+      </w:r>
+      <w:r>
+        <w:t xml:space="preserve"> </w:t>
+      </w:r>
+      <w:r>
+        <w:t xml:space="preserve">+</w:t>
+      </w:r>
+      <w:r>
+        <w:t xml:space="preserve"> </w:t>
+      </w:r>
+      <w:r>
+        <w:rPr>
+          <w:rStyle w:val="VerbatimChar"/>
+        </w:rPr>
+        <w:t xml:space="preserve">seed</w:t>
+      </w:r>
+      <w:r>
+        <w:t xml:space="preserve">), задеплоил edge function</w:t>
+      </w:r>
+      <w:r>
+        <w:t xml:space="preserve"> </w:t>
+      </w:r>
+      <w:r>
+        <w:rPr>
+          <w:rStyle w:val="VerbatimChar"/>
+        </w:rPr>
+        <w:t xml:space="preserve">diagnostic</w:t>
+      </w:r>
+      <w:r>
+        <w:t xml:space="preserve"> </w:t>
+      </w:r>
+      <w:r>
+        <w:t xml:space="preserve">(версия 1), запустил curl-тест.</w:t>
       </w:r>
     </w:p>
     <w:p>
@@ -712,68 +750,49 @@
           <w:b/>
           <w:bCs/>
         </w:rPr>
-        <w:t xml:space="preserve">Моя правка</w:t>
-      </w:r>
-      <w:r>
-        <w:t xml:space="preserve">: «Сделай 5 вопросов на одном экране со скроллом. Психологически проще: клиент видит</w:t>
-      </w:r>
-      <w:r>
-        <w:t xml:space="preserve"> </w:t>
-      </w:r>
-      <w:r>
-        <w:t xml:space="preserve">“всего 5 вопросов”</w:t>
-      </w:r>
-      <w:r>
-        <w:t xml:space="preserve">, а не</w:t>
-      </w:r>
-      <w:r>
-        <w:t xml:space="preserve"> </w:t>
-      </w:r>
-      <w:r>
-        <w:t xml:space="preserve">“сколько ещё впереди”</w:t>
-      </w:r>
-      <w:r>
-        <w:t xml:space="preserve">.» → AI переработал в</w:t>
-      </w:r>
-      <w:r>
-        <w:t xml:space="preserve"> </w:t>
-      </w:r>
-      <w:r>
-        <w:rPr>
-          <w:rStyle w:val="VerbatimChar"/>
-        </w:rPr>
-        <w:t xml:space="preserve">q-list</w:t>
-      </w:r>
-      <w:r>
-        <w:t xml:space="preserve"> </w:t>
-      </w:r>
-      <w:r>
-        <w:t xml:space="preserve">с одним финальным CTA «Дальше — выбрать время».</w:t>
-      </w:r>
-    </w:p>
-    <w:bookmarkEnd w:id="15"/>
-    <w:bookmarkStart w:id="16" w:name="итерация-2-3-mock-режим"/>
-    <w:p>
-      <w:pPr>
-        <w:pStyle w:val="Heading3"/>
-      </w:pPr>
-      <w:r>
-        <w:t xml:space="preserve">Итерация 2 → 3 (mock-режим)</w:t>
-      </w:r>
-    </w:p>
-    <w:p>
-      <w:pPr>
-        <w:pStyle w:val="FirstParagraph"/>
-      </w:pPr>
-      <w:r>
-        <w:rPr>
-          <w:b/>
-          <w:bCs/>
-        </w:rPr>
-        <w:t xml:space="preserve">Первая версия</w:t>
-      </w:r>
-      <w:r>
-        <w:t xml:space="preserve">: приложение падало без env-переменных Supabase.</w:t>
+        <w:t xml:space="preserve">Первый ответ от LLM</w:t>
+      </w:r>
+      <w:r>
+        <w:t xml:space="preserve">:</w:t>
+      </w:r>
+      <w:r>
+        <w:t xml:space="preserve"> </w:t>
+      </w:r>
+      <w:r>
+        <w:rPr>
+          <w:rStyle w:val="VerbatimChar"/>
+        </w:rPr>
+        <w:t xml:space="preserve">{"error":"OPENROUTER_API_KEY not configured"}</w:t>
+      </w:r>
+      <w:r>
+        <w:t xml:space="preserve">. AI выяснил, что секрет лежит у меня под именем</w:t>
+      </w:r>
+      <w:r>
+        <w:t xml:space="preserve"> </w:t>
+      </w:r>
+      <w:r>
+        <w:rPr>
+          <w:rStyle w:val="VerbatimChar"/>
+        </w:rPr>
+        <w:t xml:space="preserve">OPENROUTER_API</w:t>
+      </w:r>
+      <w:r>
+        <w:t xml:space="preserve"> </w:t>
+      </w:r>
+      <w:r>
+        <w:t xml:space="preserve">(без</w:t>
+      </w:r>
+      <w:r>
+        <w:t xml:space="preserve"> </w:t>
+      </w:r>
+      <w:r>
+        <w:rPr>
+          <w:rStyle w:val="VerbatimChar"/>
+        </w:rPr>
+        <w:t xml:space="preserve">_KEY</w:t>
+      </w:r>
+      <w:r>
+        <w:t xml:space="preserve">), предложил два пути — переименовать в Dashboard ИЛИ поменять код. Я выбрал «поменяй код».</w:t>
       </w:r>
     </w:p>
     <w:p>
@@ -785,77 +804,37 @@
           <w:b/>
           <w:bCs/>
         </w:rPr>
-        <w:t xml:space="preserve">Моя правка</w:t>
-      </w:r>
-      <w:r>
-        <w:t xml:space="preserve">: «Сделай так, чтобы без</w:t>
-      </w:r>
-      <w:r>
-        <w:t xml:space="preserve"> </w:t>
-      </w:r>
-      <w:r>
-        <w:rPr>
-          <w:rStyle w:val="VerbatimChar"/>
-        </w:rPr>
-        <w:t xml:space="preserve">VITE_SUPABASE_URL</w:t>
-      </w:r>
-      <w:r>
-        <w:t xml:space="preserve"> </w:t>
-      </w:r>
-      <w:r>
-        <w:t xml:space="preserve">приложение работало на mock-фолбэке: услуги из локального файла, диагностика через локальный stub. UX должен пройти end-to-end даже без бэкенда.» → AI добавил</w:t>
-      </w:r>
-      <w:r>
-        <w:t xml:space="preserve"> </w:t>
-      </w:r>
-      <w:r>
-        <w:rPr>
-          <w:rStyle w:val="VerbatimChar"/>
-        </w:rPr>
-        <w:t xml:space="preserve">hasSupabase</w:t>
-      </w:r>
-      <w:r>
-        <w:t xml:space="preserve"> </w:t>
-      </w:r>
-      <w:r>
-        <w:t xml:space="preserve">флаг и</w:t>
-      </w:r>
-      <w:r>
-        <w:t xml:space="preserve"> </w:t>
-      </w:r>
-      <w:r>
-        <w:rPr>
-          <w:rStyle w:val="VerbatimChar"/>
-        </w:rPr>
-        <w:t xml:space="preserve">mockDiagnostic()</w:t>
-      </w:r>
-      <w:r>
-        <w:t xml:space="preserve">-fallback. Это критично для демо — деплой работает с первого пуша, без настройки секретов.</w:t>
-      </w:r>
-    </w:p>
-    <w:bookmarkEnd w:id="16"/>
-    <w:bookmarkStart w:id="17" w:name="X9b4aec37ee5a34e9f25d06c318c736f52494142"/>
-    <w:p>
-      <w:pPr>
-        <w:pStyle w:val="Heading3"/>
-      </w:pPr>
-      <w:r>
-        <w:t xml:space="preserve">Итерация 3 → 4 (диагностика как продукт, не как отчёт)</w:t>
-      </w:r>
-    </w:p>
-    <w:p>
-      <w:pPr>
-        <w:pStyle w:val="FirstParagraph"/>
-      </w:pPr>
-      <w:r>
-        <w:rPr>
-          <w:b/>
-          <w:bCs/>
-        </w:rPr>
-        <w:t xml:space="preserve">Первая версия системного промпта</w:t>
-      </w:r>
-      <w:r>
-        <w:t xml:space="preserve">: 5 секций, технический тон, упоминания «пациента».</w:t>
+        <w:t xml:space="preserve">Второй ответ</w:t>
+      </w:r>
+      <w:r>
+        <w:t xml:space="preserve">: текст с гарбленной кириллицей («ДиагностНостдокумент», «перепереживитает»). Claude 3.5 Haiku явно ломается на длинных русских ответах через OpenRouter — вероятно, проблема с UTF-8 в streaming. Поменяли модель на</w:t>
+      </w:r>
+      <w:r>
+        <w:t xml:space="preserve"> </w:t>
+      </w:r>
+      <w:r>
+        <w:rPr>
+          <w:rStyle w:val="VerbatimChar"/>
+        </w:rPr>
+        <w:t xml:space="preserve">google/gemini-2.5-flash</w:t>
+      </w:r>
+      <w:r>
+        <w:t xml:space="preserve">, увеличили</w:t>
+      </w:r>
+      <w:r>
+        <w:t xml:space="preserve"> </w:t>
+      </w:r>
+      <w:r>
+        <w:rPr>
+          <w:rStyle w:val="VerbatimChar"/>
+        </w:rPr>
+        <w:t xml:space="preserve">max_tokens</w:t>
+      </w:r>
+      <w:r>
+        <w:t xml:space="preserve"> </w:t>
+      </w:r>
+      <w:r>
+        <w:t xml:space="preserve">с 800 до 1200 (русский плотнее по токенам).</w:t>
       </w:r>
     </w:p>
     <w:p>
@@ -867,46 +846,38 @@
           <w:b/>
           <w:bCs/>
         </w:rPr>
-        <w:t xml:space="preserve">Моя правка</w:t>
-      </w:r>
-      <w:r>
-        <w:t xml:space="preserve">: «Перепиши system prompt. Это рамка КОУЧИНГА, не терапии. Никаких слов</w:t>
-      </w:r>
-      <w:r>
-        <w:t xml:space="preserve"> </w:t>
-      </w:r>
-      <w:r>
-        <w:t xml:space="preserve">“диагноз”</w:t>
-      </w:r>
-      <w:r>
-        <w:t xml:space="preserve">,</w:t>
-      </w:r>
-      <w:r>
-        <w:t xml:space="preserve"> </w:t>
-      </w:r>
-      <w:r>
-        <w:t xml:space="preserve">“пациент”</w:t>
-      </w:r>
-      <w:r>
-        <w:t xml:space="preserve">,</w:t>
-      </w:r>
-      <w:r>
-        <w:t xml:space="preserve"> </w:t>
-      </w:r>
-      <w:r>
-        <w:t xml:space="preserve">“обратитесь к врачу”</w:t>
-      </w:r>
-      <w:r>
-        <w:t xml:space="preserve">. Тон бережный, на</w:t>
-      </w:r>
-      <w:r>
-        <w:t xml:space="preserve"> </w:t>
-      </w:r>
-      <w:r>
-        <w:t xml:space="preserve">“вы”</w:t>
-      </w:r>
-      <w:r>
-        <w:t xml:space="preserve">, без оценочных суждений. 4 секции, не 5.» → AI переработал, теперь промпт явно ограничивает себя коучинговой рамкой.</w:t>
+        <w:t xml:space="preserve">Третий ответ</w:t>
+      </w:r>
+      <w:r>
+        <w:t xml:space="preserve">: ровный markdown с 4 секциями, бережный тон, на «вы», без диагнозов. То что и просили.</w:t>
+      </w:r>
+    </w:p>
+    <w:p>
+      <w:pPr>
+        <w:pStyle w:val="BodyText"/>
+      </w:pPr>
+      <w:r>
+        <w:rPr>
+          <w:b/>
+          <w:bCs/>
+        </w:rPr>
+        <w:t xml:space="preserve">Чему научило</w:t>
+      </w:r>
+      <w:r>
+        <w:t xml:space="preserve">: модель — это не «зашитая» часть архитектуры. Если первая выдаёт мусор, переключение через OpenRouter — это</w:t>
+      </w:r>
+      <w:r>
+        <w:t xml:space="preserve"> </w:t>
+      </w:r>
+      <w:r>
+        <w:rPr>
+          <w:b/>
+          <w:bCs/>
+        </w:rPr>
+        <w:t xml:space="preserve">одна строка кода</w:t>
+      </w:r>
+      <w:r>
+        <w:t xml:space="preserve">. В уроке студентам показываю: храните выбор модели как переменную, чтобы быстро переключаться.</w:t>
       </w:r>
     </w:p>
     <w:p>
@@ -916,9 +887,403 @@
         </w:pict>
       </w:r>
     </w:p>
+    <w:bookmarkEnd w:id="15"/>
+    <w:bookmarkStart w:id="16" w:name="X4206dc1f8517d7307bb585a7108a09cdf21b0df"/>
+    <w:p>
+      <w:pPr>
+        <w:pStyle w:val="Heading2"/>
+      </w:pPr>
+      <w:r>
+        <w:t xml:space="preserve">Промпт 8. Отказ положить ключ в</w:t>
+      </w:r>
+      <w:r>
+        <w:t xml:space="preserve"> </w:t>
+      </w:r>
+      <w:r>
+        <w:rPr>
+          <w:rStyle w:val="VerbatimChar"/>
+        </w:rPr>
+        <w:t xml:space="preserve">.env.local</w:t>
+      </w:r>
+    </w:p>
+    <w:p>
+      <w:pPr>
+        <w:pStyle w:val="BlockText"/>
+      </w:pPr>
+      <w:r>
+        <w:t xml:space="preserve">«OPENROUTER_API_KEY я положил в env.local.»</w:t>
+      </w:r>
+    </w:p>
+    <w:p>
+      <w:pPr>
+        <w:pStyle w:val="FirstParagraph"/>
+      </w:pPr>
+      <w:r>
+        <w:rPr>
+          <w:b/>
+          <w:bCs/>
+        </w:rPr>
+        <w:t xml:space="preserve">Что вернул AI</w:t>
+      </w:r>
+      <w:r>
+        <w:t xml:space="preserve">: остановил меня. Объяснил, что</w:t>
+      </w:r>
+      <w:r>
+        <w:t xml:space="preserve"> </w:t>
+      </w:r>
+      <w:r>
+        <w:rPr>
+          <w:rStyle w:val="VerbatimChar"/>
+        </w:rPr>
+        <w:t xml:space="preserve">.env.local</w:t>
+      </w:r>
+      <w:r>
+        <w:t xml:space="preserve"> </w:t>
+      </w:r>
+      <w:r>
+        <w:t xml:space="preserve">читается</w:t>
+      </w:r>
+      <w:r>
+        <w:t xml:space="preserve"> </w:t>
+      </w:r>
+      <w:r>
+        <w:rPr>
+          <w:b/>
+          <w:bCs/>
+        </w:rPr>
+        <w:t xml:space="preserve">только фронтендом</w:t>
+      </w:r>
+      <w:r>
+        <w:t xml:space="preserve">, а в Vite даже там ключ без</w:t>
+      </w:r>
+      <w:r>
+        <w:t xml:space="preserve"> </w:t>
+      </w:r>
+      <w:r>
+        <w:rPr>
+          <w:rStyle w:val="VerbatimChar"/>
+        </w:rPr>
+        <w:t xml:space="preserve">VITE_*</w:t>
+      </w:r>
+      <w:r>
+        <w:t xml:space="preserve">-префикса в код не пробрасывается. Главное — даже если бы пробрасывался, ключ был бы виден любому посетителю сайта через DevTools, и OpenRouter снимал бы деньги с моей карты пока бот гоняет ключ.</w:t>
+      </w:r>
+    </w:p>
+    <w:p>
+      <w:pPr>
+        <w:pStyle w:val="BodyText"/>
+      </w:pPr>
+      <w:r>
+        <w:rPr>
+          <w:b/>
+          <w:bCs/>
+        </w:rPr>
+        <w:t xml:space="preserve">Что AI настоял</w:t>
+      </w:r>
+      <w:r>
+        <w:t xml:space="preserve">: положить ключ в</w:t>
+      </w:r>
+      <w:r>
+        <w:t xml:space="preserve"> </w:t>
+      </w:r>
+      <w:r>
+        <w:rPr>
+          <w:rStyle w:val="VerbatimChar"/>
+        </w:rPr>
+        <w:t xml:space="preserve">Supabase Dashboard → Edge Function Secrets</w:t>
+      </w:r>
+      <w:r>
+        <w:t xml:space="preserve">, потому что AI-вызов делает edge function (сервер), а не браузер (клиент). Ключ никогда не покидает Supabase.</w:t>
+      </w:r>
+    </w:p>
+    <w:p>
+      <w:pPr>
+        <w:pStyle w:val="BodyText"/>
+      </w:pPr>
+      <w:r>
+        <w:rPr>
+          <w:b/>
+          <w:bCs/>
+        </w:rPr>
+        <w:t xml:space="preserve">Чему научило</w:t>
+      </w:r>
+      <w:r>
+        <w:t xml:space="preserve">: AI должен</w:t>
+      </w:r>
+      <w:r>
+        <w:t xml:space="preserve"> </w:t>
+      </w:r>
+      <w:r>
+        <w:rPr>
+          <w:b/>
+          <w:bCs/>
+        </w:rPr>
+        <w:t xml:space="preserve">различать клиент и сервер</w:t>
+      </w:r>
+      <w:r>
+        <w:t xml:space="preserve"> </w:t>
+      </w:r>
+      <w:r>
+        <w:t xml:space="preserve">и не давать класть секреты на клиента, даже если так удобнее. Это самая частая ошибка нетехнических людей, которую я теперь обязательно пишу в урок отдельным разделом.</w:t>
+      </w:r>
+    </w:p>
+    <w:p>
+      <w:r>
+        <w:pict>
+          <v:rect style="width:0;height:1.5pt" o:hralign="center" o:hrstd="t" o:hr="t"/>
+        </w:pict>
+      </w:r>
+    </w:p>
+    <w:bookmarkEnd w:id="16"/>
+    <w:bookmarkStart w:id="20" w:name="Xef1a59cf50ed3bde39338dff469e2ff902c3b14"/>
+    <w:p>
+      <w:pPr>
+        <w:pStyle w:val="Heading2"/>
+      </w:pPr>
+      <w:r>
+        <w:t xml:space="preserve">Эволюция: что не сработало и как я доправлял</w:t>
+      </w:r>
+    </w:p>
+    <w:bookmarkStart w:id="17" w:name="итерация-1-2-форма-квалификации"/>
+    <w:p>
+      <w:pPr>
+        <w:pStyle w:val="Heading3"/>
+      </w:pPr>
+      <w:r>
+        <w:t xml:space="preserve">Итерация 1 → 2 (форма квалификации)</w:t>
+      </w:r>
+    </w:p>
+    <w:p>
+      <w:pPr>
+        <w:pStyle w:val="FirstParagraph"/>
+      </w:pPr>
+      <w:r>
+        <w:rPr>
+          <w:b/>
+          <w:bCs/>
+        </w:rPr>
+        <w:t xml:space="preserve">Первый вариант от AI</w:t>
+      </w:r>
+      <w:r>
+        <w:t xml:space="preserve">: 5 вопросов на отдельных шагах wizard (один вопрос — один экран).</w:t>
+      </w:r>
+    </w:p>
+    <w:p>
+      <w:pPr>
+        <w:pStyle w:val="BodyText"/>
+      </w:pPr>
+      <w:r>
+        <w:rPr>
+          <w:b/>
+          <w:bCs/>
+        </w:rPr>
+        <w:t xml:space="preserve">Моя правка</w:t>
+      </w:r>
+      <w:r>
+        <w:t xml:space="preserve">: «Сделай 5 вопросов на одном экране со скроллом. Психологически проще: клиент видит</w:t>
+      </w:r>
+      <w:r>
+        <w:t xml:space="preserve"> </w:t>
+      </w:r>
+      <w:r>
+        <w:t xml:space="preserve">“всего 5 вопросов”</w:t>
+      </w:r>
+      <w:r>
+        <w:t xml:space="preserve">, а не</w:t>
+      </w:r>
+      <w:r>
+        <w:t xml:space="preserve"> </w:t>
+      </w:r>
+      <w:r>
+        <w:t xml:space="preserve">“сколько ещё впереди”</w:t>
+      </w:r>
+      <w:r>
+        <w:t xml:space="preserve">.» → AI переработал в</w:t>
+      </w:r>
+      <w:r>
+        <w:t xml:space="preserve"> </w:t>
+      </w:r>
+      <w:r>
+        <w:rPr>
+          <w:rStyle w:val="VerbatimChar"/>
+        </w:rPr>
+        <w:t xml:space="preserve">q-list</w:t>
+      </w:r>
+      <w:r>
+        <w:t xml:space="preserve"> </w:t>
+      </w:r>
+      <w:r>
+        <w:t xml:space="preserve">с одним финальным CTA «Дальше — выбрать время».</w:t>
+      </w:r>
+    </w:p>
     <w:bookmarkEnd w:id="17"/>
+    <w:bookmarkStart w:id="18" w:name="итерация-2-3-mock-режим"/>
+    <w:p>
+      <w:pPr>
+        <w:pStyle w:val="Heading3"/>
+      </w:pPr>
+      <w:r>
+        <w:t xml:space="preserve">Итерация 2 → 3 (mock-режим)</w:t>
+      </w:r>
+    </w:p>
+    <w:p>
+      <w:pPr>
+        <w:pStyle w:val="FirstParagraph"/>
+      </w:pPr>
+      <w:r>
+        <w:rPr>
+          <w:b/>
+          <w:bCs/>
+        </w:rPr>
+        <w:t xml:space="preserve">Первая версия</w:t>
+      </w:r>
+      <w:r>
+        <w:t xml:space="preserve">: приложение падало без env-переменных Supabase.</w:t>
+      </w:r>
+    </w:p>
+    <w:p>
+      <w:pPr>
+        <w:pStyle w:val="BodyText"/>
+      </w:pPr>
+      <w:r>
+        <w:rPr>
+          <w:b/>
+          <w:bCs/>
+        </w:rPr>
+        <w:t xml:space="preserve">Моя правка</w:t>
+      </w:r>
+      <w:r>
+        <w:t xml:space="preserve">: «Сделай так, чтобы без</w:t>
+      </w:r>
+      <w:r>
+        <w:t xml:space="preserve"> </w:t>
+      </w:r>
+      <w:r>
+        <w:rPr>
+          <w:rStyle w:val="VerbatimChar"/>
+        </w:rPr>
+        <w:t xml:space="preserve">VITE_SUPABASE_URL</w:t>
+      </w:r>
+      <w:r>
+        <w:t xml:space="preserve"> </w:t>
+      </w:r>
+      <w:r>
+        <w:t xml:space="preserve">приложение работало на mock-фолбэке: услуги из локального файла, диагностика через локальный stub. UX должен пройти end-to-end даже без бэкенда.» → AI добавил</w:t>
+      </w:r>
+      <w:r>
+        <w:t xml:space="preserve"> </w:t>
+      </w:r>
+      <w:r>
+        <w:rPr>
+          <w:rStyle w:val="VerbatimChar"/>
+        </w:rPr>
+        <w:t xml:space="preserve">hasSupabase</w:t>
+      </w:r>
+      <w:r>
+        <w:t xml:space="preserve"> </w:t>
+      </w:r>
+      <w:r>
+        <w:t xml:space="preserve">флаг и</w:t>
+      </w:r>
+      <w:r>
+        <w:t xml:space="preserve"> </w:t>
+      </w:r>
+      <w:r>
+        <w:rPr>
+          <w:rStyle w:val="VerbatimChar"/>
+        </w:rPr>
+        <w:t xml:space="preserve">mockDiagnostic()</w:t>
+      </w:r>
+      <w:r>
+        <w:t xml:space="preserve">-fallback. Это критично для демо — деплой работает с первого пуша, без настройки секретов.</w:t>
+      </w:r>
+    </w:p>
     <w:bookmarkEnd w:id="18"/>
-    <w:bookmarkStart w:id="19" w:name="метаурок"/>
+    <w:bookmarkStart w:id="19" w:name="X9b4aec37ee5a34e9f25d06c318c736f52494142"/>
+    <w:p>
+      <w:pPr>
+        <w:pStyle w:val="Heading3"/>
+      </w:pPr>
+      <w:r>
+        <w:t xml:space="preserve">Итерация 3 → 4 (диагностика как продукт, не как отчёт)</w:t>
+      </w:r>
+    </w:p>
+    <w:p>
+      <w:pPr>
+        <w:pStyle w:val="FirstParagraph"/>
+      </w:pPr>
+      <w:r>
+        <w:rPr>
+          <w:b/>
+          <w:bCs/>
+        </w:rPr>
+        <w:t xml:space="preserve">Первая версия системного промпта</w:t>
+      </w:r>
+      <w:r>
+        <w:t xml:space="preserve">: 5 секций, технический тон, упоминания «пациента».</w:t>
+      </w:r>
+    </w:p>
+    <w:p>
+      <w:pPr>
+        <w:pStyle w:val="BodyText"/>
+      </w:pPr>
+      <w:r>
+        <w:rPr>
+          <w:b/>
+          <w:bCs/>
+        </w:rPr>
+        <w:t xml:space="preserve">Моя правка</w:t>
+      </w:r>
+      <w:r>
+        <w:t xml:space="preserve">: «Перепиши system prompt. Это рамка КОУЧИНГА, не терапии. Никаких слов</w:t>
+      </w:r>
+      <w:r>
+        <w:t xml:space="preserve"> </w:t>
+      </w:r>
+      <w:r>
+        <w:t xml:space="preserve">“диагноз”</w:t>
+      </w:r>
+      <w:r>
+        <w:t xml:space="preserve">,</w:t>
+      </w:r>
+      <w:r>
+        <w:t xml:space="preserve"> </w:t>
+      </w:r>
+      <w:r>
+        <w:t xml:space="preserve">“пациент”</w:t>
+      </w:r>
+      <w:r>
+        <w:t xml:space="preserve">,</w:t>
+      </w:r>
+      <w:r>
+        <w:t xml:space="preserve"> </w:t>
+      </w:r>
+      <w:r>
+        <w:t xml:space="preserve">“обратитесь к врачу”</w:t>
+      </w:r>
+      <w:r>
+        <w:t xml:space="preserve">. Тон бережный, на</w:t>
+      </w:r>
+      <w:r>
+        <w:t xml:space="preserve"> </w:t>
+      </w:r>
+      <w:r>
+        <w:t xml:space="preserve">“вы”</w:t>
+      </w:r>
+      <w:r>
+        <w:t xml:space="preserve">, без оценочных суждений. 4 секции, не 5.» → AI переработал, теперь промпт явно ограничивает себя коучинговой рамкой.</w:t>
+      </w:r>
+    </w:p>
+    <w:p>
+      <w:r>
+        <w:pict>
+          <v:rect style="width:0;height:1.5pt" o:hralign="center" o:hrstd="t" o:hr="t"/>
+        </w:pict>
+      </w:r>
+    </w:p>
+    <w:bookmarkEnd w:id="19"/>
+    <w:bookmarkEnd w:id="20"/>
+    <w:bookmarkStart w:id="21" w:name="метаурок"/>
     <w:p>
       <w:pPr>
         <w:pStyle w:val="Heading2"/>
@@ -1065,8 +1430,8 @@
         <w:t xml:space="preserve">. Если он соглашается со всем, я делаю что-то не так — либо мой промпт не оставляет места для альтернатив, либо я не настроил AI на pushback. В правильном диалоге AI несколько раз сказал «не делайте этого вот так, потому что…» — и это сэкономило несколько часов.</w:t>
       </w:r>
     </w:p>
-    <w:bookmarkEnd w:id="19"/>
-    <w:bookmarkEnd w:id="20"/>
+    <w:bookmarkEnd w:id="21"/>
+    <w:bookmarkEnd w:id="22"/>
     <w:sectPr>
       <w:footnotePr>
         <w:numRestart w:val="eachSect"/>

</xml_diff>